<commit_message>
Format Section A publication links as full references
Replace the bare-URL bullet list with formatted citations (author,
year, italicized title, client, link) in the v2 draft.

https://claude.ai/code/session_019TtcDus6jNBaB6VZWkcnXB
</commit_message>
<xml_diff>
--- a/proposals/wisconsin-osb/VS_Proposal_Online_Sports_Betting_Wisconsin_Data_Analysis_REVISED_v2_061226.docx
+++ b/proposals/wisconsin-osb/VS_Proposal_Online_Sports_Betting_Wisconsin_Data_Analysis_REVISED_v2_061226.docx
@@ -871,23 +871,34 @@
       <w:pPr>
         <w:pStyle w:val="ListBullet"/>
       </w:pPr>
+      <w:r>
+        <w:rPr>
+          <w:rFonts w:ascii="Georgia" w:hAnsi="Georgia" w:eastAsia="Georgia"/>
+          <w:b w:val="0"/>
+          <w:i w:val="0"/>
+          <w:sz w:val="21"/>
+        </w:rPr>
+        <w:t xml:space="preserve">Meister Economic Consulting &amp; Victor-Strategies (2019). </w:t>
+      </w:r>
+      <w:r>
+        <w:rPr>
+          <w:rFonts w:ascii="Georgia" w:hAnsi="Georgia" w:eastAsia="Georgia"/>
+          <w:b w:val="0"/>
+          <w:i/>
+          <w:sz w:val="21"/>
+        </w:rPr>
+        <w:t xml:space="preserve">Economic Impact of New Jersey Online Gaming: Further Lessons Learned. </w:t>
+      </w:r>
+      <w:r>
+        <w:rPr>
+          <w:rFonts w:ascii="Georgia" w:hAnsi="Georgia" w:eastAsia="Georgia"/>
+          <w:b w:val="0"/>
+          <w:i w:val="0"/>
+          <w:sz w:val="21"/>
+        </w:rPr>
+        <w:t xml:space="preserve">Prepared for iDEA Growth (Interactive Digital Entertainment Association). </w:t>
+      </w:r>
       <w:hyperlink r:id="rId12">
-        <w:r>
-          <w:rPr>
-            <w:rFonts w:ascii="Georgia" w:hAnsi="Georgia"/>
-            <w:color w:val="1155CC"/>
-            <w:sz w:val="19"/>
-            <w:u w:val="single"/>
-          </w:rPr>
-          <w:t>https://ideagrowth.org/research/</w:t>
-        </w:r>
-      </w:hyperlink>
-    </w:p>
-    <w:p>
-      <w:pPr>
-        <w:pStyle w:val="ListBullet"/>
-      </w:pPr>
-      <w:hyperlink r:id="rId13">
         <w:r>
           <w:rPr>
             <w:rFonts w:ascii="Georgia" w:hAnsi="Georgia"/>
@@ -903,7 +914,34 @@
       <w:pPr>
         <w:pStyle w:val="ListBullet"/>
       </w:pPr>
-      <w:hyperlink r:id="rId14">
+      <w:r>
+        <w:rPr>
+          <w:rFonts w:ascii="Georgia" w:hAnsi="Georgia" w:eastAsia="Georgia"/>
+          <w:b w:val="0"/>
+          <w:i w:val="0"/>
+          <w:sz w:val="21"/>
+        </w:rPr>
+        <w:t xml:space="preserve">Eilers &amp; Krejcik Gaming (2018). </w:t>
+      </w:r>
+      <w:r>
+        <w:rPr>
+          <w:rFonts w:ascii="Georgia" w:hAnsi="Georgia" w:eastAsia="Georgia"/>
+          <w:b w:val="0"/>
+          <w:i/>
+          <w:sz w:val="21"/>
+        </w:rPr>
+        <w:t xml:space="preserve">Regulated Sports Betting in Indiana: Landscape, Analysis, and Recommendations. </w:t>
+      </w:r>
+      <w:r>
+        <w:rPr>
+          <w:rFonts w:ascii="Georgia" w:hAnsi="Georgia" w:eastAsia="Georgia"/>
+          <w:b w:val="0"/>
+          <w:i w:val="0"/>
+          <w:sz w:val="21"/>
+        </w:rPr>
+        <w:t xml:space="preserve">Prepared for the Indiana Gaming Commission. </w:t>
+      </w:r>
+      <w:hyperlink r:id="rId13">
         <w:r>
           <w:rPr>
             <w:rFonts w:ascii="Georgia" w:hAnsi="Georgia"/>
@@ -919,7 +957,34 @@
       <w:pPr>
         <w:pStyle w:val="ListBullet"/>
       </w:pPr>
-      <w:hyperlink r:id="rId15">
+      <w:r>
+        <w:rPr>
+          <w:rFonts w:ascii="Georgia" w:hAnsi="Georgia" w:eastAsia="Georgia"/>
+          <w:b w:val="0"/>
+          <w:i w:val="0"/>
+          <w:sz w:val="21"/>
+        </w:rPr>
+        <w:t xml:space="preserve">Eilers &amp; Krejcik Gaming, in partnership with Victor-Strategies (2019). </w:t>
+      </w:r>
+      <w:r>
+        <w:rPr>
+          <w:rFonts w:ascii="Georgia" w:hAnsi="Georgia" w:eastAsia="Georgia"/>
+          <w:b w:val="0"/>
+          <w:i/>
+          <w:sz w:val="21"/>
+        </w:rPr>
+        <w:t xml:space="preserve">The More You Know the Bettor: Defining U.S. Sports Betting Customer Personas. </w:t>
+      </w:r>
+      <w:r>
+        <w:rPr>
+          <w:rFonts w:ascii="Georgia" w:hAnsi="Georgia" w:eastAsia="Georgia"/>
+          <w:b w:val="0"/>
+          <w:i w:val="0"/>
+          <w:sz w:val="21"/>
+        </w:rPr>
+        <w:t xml:space="preserve">Consumer research report and article series published by SBC Americas. </w:t>
+      </w:r>
+      <w:hyperlink r:id="rId14">
         <w:r>
           <w:rPr>
             <w:rFonts w:ascii="Georgia" w:hAnsi="Georgia"/>
@@ -935,6 +1000,76 @@
       <w:pPr>
         <w:pStyle w:val="ListBullet"/>
       </w:pPr>
+      <w:r>
+        <w:rPr>
+          <w:rFonts w:ascii="Georgia" w:hAnsi="Georgia" w:eastAsia="Georgia"/>
+          <w:b w:val="0"/>
+          <w:i w:val="0"/>
+          <w:sz w:val="21"/>
+        </w:rPr>
+        <w:t xml:space="preserve">Spectrum Gaming Group (2010). </w:t>
+      </w:r>
+      <w:r>
+        <w:rPr>
+          <w:rFonts w:ascii="Georgia" w:hAnsi="Georgia" w:eastAsia="Georgia"/>
+          <w:b w:val="0"/>
+          <w:i/>
+          <w:sz w:val="21"/>
+        </w:rPr>
+        <w:t xml:space="preserve">Internet Gaming White Paper. </w:t>
+      </w:r>
+      <w:r>
+        <w:rPr>
+          <w:rFonts w:ascii="Georgia" w:hAnsi="Georgia" w:eastAsia="Georgia"/>
+          <w:b w:val="0"/>
+          <w:i w:val="0"/>
+          <w:sz w:val="21"/>
+        </w:rPr>
+        <w:t xml:space="preserve">Prepared for the National Indian Gaming Association. </w:t>
+      </w:r>
+      <w:hyperlink r:id="rId15">
+        <w:r>
+          <w:rPr>
+            <w:rFonts w:ascii="Georgia" w:hAnsi="Georgia"/>
+            <w:color w:val="1155CC"/>
+            <w:sz w:val="19"/>
+            <w:u w:val="single"/>
+          </w:rPr>
+          <w:t>http://www.indiangaming.org/info/alerts/Spectrum-Internet-Paper.pdf</w:t>
+        </w:r>
+      </w:hyperlink>
+    </w:p>
+    <w:p>
+      <w:pPr>
+        <w:pStyle w:val="ListBullet"/>
+      </w:pPr>
+      <w:r>
+        <w:rPr>
+          <w:rFonts w:ascii="Georgia" w:hAnsi="Georgia" w:eastAsia="Georgia"/>
+          <w:b w:val="0"/>
+          <w:i w:val="0"/>
+          <w:sz w:val="21"/>
+        </w:rPr>
+        <w:t xml:space="preserve">iDEA Growth. </w:t>
+      </w:r>
+      <w:r>
+        <w:rPr>
+          <w:rFonts w:ascii="Georgia" w:hAnsi="Georgia" w:eastAsia="Georgia"/>
+          <w:b w:val="0"/>
+          <w:i/>
+          <w:sz w:val="21"/>
+        </w:rPr>
+        <w:t xml:space="preserve">Research Library. </w:t>
+      </w:r>
+      <w:r>
+        <w:rPr>
+          <w:rFonts w:ascii="Georgia" w:hAnsi="Georgia" w:eastAsia="Georgia"/>
+          <w:b w:val="0"/>
+          <w:i w:val="0"/>
+          <w:sz w:val="21"/>
+        </w:rPr>
+        <w:t xml:space="preserve">Repository of published iDEA-commissioned studies, including the 2024 rebuttal analysis discussed in Section A. </w:t>
+      </w:r>
       <w:hyperlink r:id="rId16">
         <w:r>
           <w:rPr>
@@ -943,7 +1078,7 @@
             <w:sz w:val="19"/>
             <w:u w:val="single"/>
           </w:rPr>
-          <w:t>http://www.indiangaming.org/info/alerts/Spectrum-Internet-Paper.pdf</w:t>
+          <w:t>https://ideagrowth.org/research/</w:t>
         </w:r>
       </w:hyperlink>
     </w:p>
@@ -1354,7 +1489,7 @@
         </w:rPr>
         <w:t xml:space="preserve">Forecast: Eilers &amp; Krejcik Gaming (2018), Regulated Sports Betting in Indiana, prepared for the Indiana Gaming Commission, </w:t>
       </w:r>
-      <w:hyperlink r:id="rId14">
+      <w:hyperlink r:id="rId13">
         <w:r>
           <w:rPr>
             <w:rFonts w:ascii="Georgia" w:hAnsi="Georgia"/>
@@ -5375,7 +5510,7 @@
         </w:rPr>
         <w:t xml:space="preserve">2010 Internet Gaming White Paper — </w:t>
       </w:r>
-      <w:hyperlink r:id="rId16">
+      <w:hyperlink r:id="rId15">
         <w:r>
           <w:rPr>
             <w:rFonts w:ascii="Georgia" w:hAnsi="Georgia"/>

</xml_diff>